<commit_message>
feat: allow wmspl.co.in and pwsfloor.com recipients; digest email once a month; email guide updated (4.2 CC, 4.5 frequency)
Co-Authored-By: Claude Sonnet 5.5 <noreply@anthropic.com>
</commit_message>
<xml_diff>
--- a/docs/ONEPWS_Email_Guide.docx
+++ b/docs/ONEPWS_Email_Guide.docx
@@ -132,7 +132,7 @@
           <w:sz w:val="21"/>
           <w:szCs w:val="21"/>
         </w:rPr>
-        <w:t xml:space="preserve"> Emails go only to @onepws.com addresses. A customer or any outside address is never emailed.</w:t>
+        <w:t xml:space="preserve"> Emails go only to company addresses: @onepws.com, @wmspl.co.in and @pwsfloor.com. A customer or any other outside address is never emailed.</w:t>
       </w:r>
     </w:p>
     <w:p>
@@ -400,7 +400,7 @@
           <w:sz w:val="21"/>
           <w:szCs w:val="21"/>
         </w:rPr>
-        <w:t xml:space="preserve">Before any email is sent, every address in To, CC and BCC is checked. Only addresses ending in @onepws.com are allowed. Anything else is removed, and a line is written in the Email Log: "Skipped: Blocked external address(es)". The remaining company recipients still receive the email. If no company address is left, nothing is sent.</w:t>
+        <w:t xml:space="preserve">Before any email is sent, every address in To, CC and BCC is checked. Only addresses ending in @onepws.com, @wmspl.co.in or @pwsfloor.com are allowed. Anything else is removed, and a line is written in the Email Log: "Skipped: Blocked external address(es)". The remaining company recipients still receive the email. If no company address is left, nothing is sent.</w:t>
       </w:r>
     </w:p>
     <w:p>
@@ -413,7 +413,7 @@
           <w:sz w:val="21"/>
           <w:szCs w:val="21"/>
         </w:rPr>
-        <w:t xml:space="preserve">This also protects against look-alike addresses such as someone@onepws.com.other.com or someone@notonepws.com. The customer contact stored on a complaint is never used as an email recipient.</w:t>
+        <w:t xml:space="preserve">This also protects against look-alike addresses such as someone@onepws.com.other.com or someone@notpwsfloor.com. The customer contact stored on a complaint is never used as an email recipient.</w:t>
       </w:r>
     </w:p>
     <w:p>
@@ -2317,7 +2317,7 @@
           <w:sz w:val="21"/>
           <w:szCs w:val="21"/>
         </w:rPr>
-        <w:t xml:space="preserve">Three scheduled jobs run on Vercel every day. They are protected by a secret key, so only the scheduler can start them.</w:t>
+        <w:t xml:space="preserve">Three scheduled jobs run on Vercel: two every day and the digest once a month. They are protected by a secret key, so only the scheduler can start them.</w:t>
       </w:r>
     </w:p>
     <w:tbl>
@@ -2794,7 +2794,7 @@
                 <w:sz w:val="18"/>
                 <w:szCs w:val="18"/>
               </w:rPr>
-              <w:t xml:space="preserve">Daily summary (and the weekly summary on Mondays)</w:t>
+              <w:t xml:space="preserve">The monthly quality digest</w:t>
             </w:r>
           </w:p>
         </w:tc>
@@ -2824,7 +2824,7 @@
                 <w:sz w:val="18"/>
                 <w:szCs w:val="18"/>
               </w:rPr>
-              <w:t xml:space="preserve">17:30 Monday to Friday</w:t>
+              <w:t xml:space="preserve">17:30 on the 1st of each month</w:t>
             </w:r>
           </w:p>
         </w:tc>
@@ -2854,7 +2854,7 @@
                 <w:sz w:val="18"/>
                 <w:szCs w:val="18"/>
               </w:rPr>
-              <w:t xml:space="preserve">11:00 PM Monday to Friday</w:t>
+              <w:t xml:space="preserve">11:00 PM on the 1st of each month</w:t>
             </w:r>
           </w:p>
         </w:tc>
@@ -2909,7 +2909,7 @@
           <w:sz w:val="21"/>
           <w:szCs w:val="21"/>
         </w:rPr>
-        <w:t xml:space="preserve">"Extra CC" below is on top of the standard CC list in section 2.2. "Repeats" says how often the same email can come again.</w:t>
+        <w:t xml:space="preserve">"Extra CC" below is on top of the standard CC list in section 2.2 (in 4.2 the CC column shows the full list instead). "Repeats" says how often the same email can come again.</w:t>
       </w:r>
     </w:p>
     <w:p>
@@ -4388,11 +4388,11 @@
         </w:tblBorders>
       </w:tblPr>
       <w:tblGrid>
-        <w:gridCol w:w="1700"/>
-        <w:gridCol w:w="2600"/>
-        <w:gridCol w:w="2150"/>
-        <w:gridCol w:w="1900"/>
-        <w:gridCol w:w="1288"/>
+        <w:gridCol w:w="1500"/>
+        <w:gridCol w:w="2400"/>
+        <w:gridCol w:w="1650"/>
+        <w:gridCol w:w="2900"/>
+        <w:gridCol w:w="1188"/>
       </w:tblGrid>
       <w:tr>
         <w:trPr>
@@ -4401,7 +4401,7 @@
         </w:trPr>
         <w:tc>
           <w:tcPr>
-            <w:tcW w:type="dxa" w:w="1700"/>
+            <w:tcW w:type="dxa" w:w="1500"/>
             <w:tcBorders>
               <w:top w:val="single" w:color="CBD5E1" w:sz="4"/>
               <w:left w:val="single" w:color="CBD5E1" w:sz="4"/>
@@ -4435,7 +4435,7 @@
         </w:tc>
         <w:tc>
           <w:tcPr>
-            <w:tcW w:type="dxa" w:w="2600"/>
+            <w:tcW w:type="dxa" w:w="2400"/>
             <w:tcBorders>
               <w:top w:val="single" w:color="CBD5E1" w:sz="4"/>
               <w:left w:val="single" w:color="CBD5E1" w:sz="4"/>
@@ -4469,7 +4469,7 @@
         </w:tc>
         <w:tc>
           <w:tcPr>
-            <w:tcW w:type="dxa" w:w="2150"/>
+            <w:tcW w:type="dxa" w:w="1650"/>
             <w:tcBorders>
               <w:top w:val="single" w:color="CBD5E1" w:sz="4"/>
               <w:left w:val="single" w:color="CBD5E1" w:sz="4"/>
@@ -4503,7 +4503,7 @@
         </w:tc>
         <w:tc>
           <w:tcPr>
-            <w:tcW w:type="dxa" w:w="1900"/>
+            <w:tcW w:type="dxa" w:w="2900"/>
             <w:tcBorders>
               <w:top w:val="single" w:color="CBD5E1" w:sz="4"/>
               <w:left w:val="single" w:color="CBD5E1" w:sz="4"/>
@@ -4531,13 +4531,13 @@
                 <w:sz w:val="18"/>
                 <w:szCs w:val="18"/>
               </w:rPr>
-              <w:t xml:space="preserve">Extra CC</w:t>
-            </w:r>
-          </w:p>
-        </w:tc>
-        <w:tc>
-          <w:tcPr>
-            <w:tcW w:type="dxa" w:w="1288"/>
+              <w:t xml:space="preserve">CC</w:t>
+            </w:r>
+          </w:p>
+        </w:tc>
+        <w:tc>
+          <w:tcPr>
+            <w:tcW w:type="dxa" w:w="1188"/>
             <w:tcBorders>
               <w:top w:val="single" w:color="CBD5E1" w:sz="4"/>
               <w:left w:val="single" w:color="CBD5E1" w:sz="4"/>
@@ -4576,7 +4576,7 @@
         </w:trPr>
         <w:tc>
           <w:tcPr>
-            <w:tcW w:type="dxa" w:w="1700"/>
+            <w:tcW w:type="dxa" w:w="1500"/>
             <w:tcBorders>
               <w:top w:val="single" w:color="CBD5E1" w:sz="4"/>
               <w:left w:val="single" w:color="CBD5E1" w:sz="4"/>
@@ -4624,7 +4624,7 @@
         </w:tc>
         <w:tc>
           <w:tcPr>
-            <w:tcW w:type="dxa" w:w="2600"/>
+            <w:tcW w:type="dxa" w:w="2400"/>
             <w:tcBorders>
               <w:top w:val="single" w:color="CBD5E1" w:sz="4"/>
               <w:left w:val="single" w:color="CBD5E1" w:sz="4"/>
@@ -4654,7 +4654,7 @@
         </w:tc>
         <w:tc>
           <w:tcPr>
-            <w:tcW w:type="dxa" w:w="2150"/>
+            <w:tcW w:type="dxa" w:w="1650"/>
             <w:tcBorders>
               <w:top w:val="single" w:color="CBD5E1" w:sz="4"/>
               <w:left w:val="single" w:color="CBD5E1" w:sz="4"/>
@@ -4684,37 +4684,37 @@
         </w:tc>
         <w:tc>
           <w:tcPr>
-            <w:tcW w:type="dxa" w:w="1900"/>
-            <w:tcBorders>
-              <w:top w:val="single" w:color="CBD5E1" w:sz="4"/>
-              <w:left w:val="single" w:color="CBD5E1" w:sz="4"/>
-              <w:bottom w:val="single" w:color="CBD5E1" w:sz="4"/>
-              <w:right w:val="single" w:color="CBD5E1" w:sz="4"/>
-            </w:tcBorders>
-            <w:tcMar>
-              <w:top w:type="dxa" w:w="70"/>
-              <w:left w:type="dxa" w:w="100"/>
-              <w:bottom w:type="dxa" w:w="70"/>
-              <w:right w:type="dxa" w:w="100"/>
-            </w:tcMar>
-          </w:tcPr>
-          <w:p>
-            <w:pPr>
-              <w:spacing w:after="30" w:line="250"/>
-            </w:pPr>
-            <w:r>
-              <w:rPr>
-                <w:rFonts w:ascii="Calibri" w:cs="Calibri" w:eastAsia="Calibri" w:hAnsi="Calibri"/>
-                <w:sz w:val="18"/>
-                <w:szCs w:val="18"/>
-              </w:rPr>
-              <w:t xml:space="preserve">None (no Management)</w:t>
-            </w:r>
-          </w:p>
-        </w:tc>
-        <w:tc>
-          <w:tcPr>
-            <w:tcW w:type="dxa" w:w="1288"/>
+            <w:tcW w:type="dxa" w:w="2900"/>
+            <w:tcBorders>
+              <w:top w:val="single" w:color="CBD5E1" w:sz="4"/>
+              <w:left w:val="single" w:color="CBD5E1" w:sz="4"/>
+              <w:bottom w:val="single" w:color="CBD5E1" w:sz="4"/>
+              <w:right w:val="single" w:color="CBD5E1" w:sz="4"/>
+            </w:tcBorders>
+            <w:tcMar>
+              <w:top w:type="dxa" w:w="70"/>
+              <w:left w:type="dxa" w:w="100"/>
+              <w:bottom w:type="dxa" w:w="70"/>
+              <w:right w:type="dxa" w:w="100"/>
+            </w:tcMar>
+          </w:tcPr>
+          <w:p>
+            <w:pPr>
+              <w:spacing w:after="30" w:line="250"/>
+            </w:pPr>
+            <w:r>
+              <w:rPr>
+                <w:rFonts w:ascii="Calibri" w:cs="Calibri" w:eastAsia="Calibri" w:hAnsi="Calibri"/>
+                <w:sz w:val="18"/>
+                <w:szCs w:val="18"/>
+              </w:rPr>
+              <w:t xml:space="preserve">The 3 common mailboxes + department Manager and HOD. No Management</w:t>
+            </w:r>
+          </w:p>
+        </w:tc>
+        <w:tc>
+          <w:tcPr>
+            <w:tcW w:type="dxa" w:w="1188"/>
             <w:tcBorders>
               <w:top w:val="single" w:color="CBD5E1" w:sz="4"/>
               <w:left w:val="single" w:color="CBD5E1" w:sz="4"/>
@@ -4749,7 +4749,7 @@
         </w:trPr>
         <w:tc>
           <w:tcPr>
-            <w:tcW w:type="dxa" w:w="1700"/>
+            <w:tcW w:type="dxa" w:w="1500"/>
             <w:tcBorders>
               <w:top w:val="single" w:color="CBD5E1" w:sz="4"/>
               <w:left w:val="single" w:color="CBD5E1" w:sz="4"/>
@@ -4798,7 +4798,7 @@
         </w:tc>
         <w:tc>
           <w:tcPr>
-            <w:tcW w:type="dxa" w:w="2600"/>
+            <w:tcW w:type="dxa" w:w="2400"/>
             <w:tcBorders>
               <w:top w:val="single" w:color="CBD5E1" w:sz="4"/>
               <w:left w:val="single" w:color="CBD5E1" w:sz="4"/>
@@ -4829,7 +4829,7 @@
         </w:tc>
         <w:tc>
           <w:tcPr>
-            <w:tcW w:type="dxa" w:w="2150"/>
+            <w:tcW w:type="dxa" w:w="1650"/>
             <w:tcBorders>
               <w:top w:val="single" w:color="CBD5E1" w:sz="4"/>
               <w:left w:val="single" w:color="CBD5E1" w:sz="4"/>
@@ -4860,7 +4860,7 @@
         </w:tc>
         <w:tc>
           <w:tcPr>
-            <w:tcW w:type="dxa" w:w="1900"/>
+            <w:tcW w:type="dxa" w:w="2900"/>
             <w:tcBorders>
               <w:top w:val="single" w:color="CBD5E1" w:sz="4"/>
               <w:left w:val="single" w:color="CBD5E1" w:sz="4"/>
@@ -4885,13 +4885,13 @@
                 <w:sz w:val="18"/>
                 <w:szCs w:val="18"/>
               </w:rPr>
-              <w:t xml:space="preserve">None (no Management)</w:t>
-            </w:r>
-          </w:p>
-        </w:tc>
-        <w:tc>
-          <w:tcPr>
-            <w:tcW w:type="dxa" w:w="1288"/>
+              <w:t xml:space="preserve">The 3 common mailboxes + department Manager and HOD. No Management</w:t>
+            </w:r>
+          </w:p>
+        </w:tc>
+        <w:tc>
+          <w:tcPr>
+            <w:tcW w:type="dxa" w:w="1188"/>
             <w:tcBorders>
               <w:top w:val="single" w:color="CBD5E1" w:sz="4"/>
               <w:left w:val="single" w:color="CBD5E1" w:sz="4"/>
@@ -4927,7 +4927,7 @@
         </w:trPr>
         <w:tc>
           <w:tcPr>
-            <w:tcW w:type="dxa" w:w="1700"/>
+            <w:tcW w:type="dxa" w:w="1500"/>
             <w:tcBorders>
               <w:top w:val="single" w:color="CBD5E1" w:sz="4"/>
               <w:left w:val="single" w:color="CBD5E1" w:sz="4"/>
@@ -4975,7 +4975,7 @@
         </w:tc>
         <w:tc>
           <w:tcPr>
-            <w:tcW w:type="dxa" w:w="2600"/>
+            <w:tcW w:type="dxa" w:w="2400"/>
             <w:tcBorders>
               <w:top w:val="single" w:color="CBD5E1" w:sz="4"/>
               <w:left w:val="single" w:color="CBD5E1" w:sz="4"/>
@@ -5005,7 +5005,7 @@
         </w:tc>
         <w:tc>
           <w:tcPr>
-            <w:tcW w:type="dxa" w:w="2150"/>
+            <w:tcW w:type="dxa" w:w="1650"/>
             <w:tcBorders>
               <w:top w:val="single" w:color="CBD5E1" w:sz="4"/>
               <w:left w:val="single" w:color="CBD5E1" w:sz="4"/>
@@ -5035,37 +5035,37 @@
         </w:tc>
         <w:tc>
           <w:tcPr>
-            <w:tcW w:type="dxa" w:w="1900"/>
-            <w:tcBorders>
-              <w:top w:val="single" w:color="CBD5E1" w:sz="4"/>
-              <w:left w:val="single" w:color="CBD5E1" w:sz="4"/>
-              <w:bottom w:val="single" w:color="CBD5E1" w:sz="4"/>
-              <w:right w:val="single" w:color="CBD5E1" w:sz="4"/>
-            </w:tcBorders>
-            <w:tcMar>
-              <w:top w:type="dxa" w:w="70"/>
-              <w:left w:type="dxa" w:w="100"/>
-              <w:bottom w:type="dxa" w:w="70"/>
-              <w:right w:type="dxa" w:w="100"/>
-            </w:tcMar>
-          </w:tcPr>
-          <w:p>
-            <w:pPr>
-              <w:spacing w:after="30" w:line="250"/>
-            </w:pPr>
-            <w:r>
-              <w:rPr>
-                <w:rFonts w:ascii="Calibri" w:cs="Calibri" w:eastAsia="Calibri" w:hAnsi="Calibri"/>
-                <w:sz w:val="18"/>
-                <w:szCs w:val="18"/>
-              </w:rPr>
-              <w:t xml:space="preserve">Management, but only when a stage is more than 10 days late</w:t>
-            </w:r>
-          </w:p>
-        </w:tc>
-        <w:tc>
-          <w:tcPr>
-            <w:tcW w:type="dxa" w:w="1288"/>
+            <w:tcW w:type="dxa" w:w="2900"/>
+            <w:tcBorders>
+              <w:top w:val="single" w:color="CBD5E1" w:sz="4"/>
+              <w:left w:val="single" w:color="CBD5E1" w:sz="4"/>
+              <w:bottom w:val="single" w:color="CBD5E1" w:sz="4"/>
+              <w:right w:val="single" w:color="CBD5E1" w:sz="4"/>
+            </w:tcBorders>
+            <w:tcMar>
+              <w:top w:type="dxa" w:w="70"/>
+              <w:left w:type="dxa" w:w="100"/>
+              <w:bottom w:type="dxa" w:w="70"/>
+              <w:right w:type="dxa" w:w="100"/>
+            </w:tcMar>
+          </w:tcPr>
+          <w:p>
+            <w:pPr>
+              <w:spacing w:after="30" w:line="250"/>
+            </w:pPr>
+            <w:r>
+              <w:rPr>
+                <w:rFonts w:ascii="Calibri" w:cs="Calibri" w:eastAsia="Calibri" w:hAnsi="Calibri"/>
+                <w:sz w:val="18"/>
+                <w:szCs w:val="18"/>
+              </w:rPr>
+              <w:t xml:space="preserve">The 3 common mailboxes + department Manager and HOD. Management is added only when a stage is more than 10 days late</w:t>
+            </w:r>
+          </w:p>
+        </w:tc>
+        <w:tc>
+          <w:tcPr>
+            <w:tcW w:type="dxa" w:w="1188"/>
             <w:tcBorders>
               <w:top w:val="single" w:color="CBD5E1" w:sz="4"/>
               <w:left w:val="single" w:color="CBD5E1" w:sz="4"/>
@@ -5118,7 +5118,7 @@
         </w:trPr>
         <w:tc>
           <w:tcPr>
-            <w:tcW w:type="dxa" w:w="1700"/>
+            <w:tcW w:type="dxa" w:w="1500"/>
             <w:tcBorders>
               <w:top w:val="single" w:color="CBD5E1" w:sz="4"/>
               <w:left w:val="single" w:color="CBD5E1" w:sz="4"/>
@@ -5167,7 +5167,7 @@
         </w:tc>
         <w:tc>
           <w:tcPr>
-            <w:tcW w:type="dxa" w:w="2600"/>
+            <w:tcW w:type="dxa" w:w="2400"/>
             <w:tcBorders>
               <w:top w:val="single" w:color="CBD5E1" w:sz="4"/>
               <w:left w:val="single" w:color="CBD5E1" w:sz="4"/>
@@ -5198,7 +5198,7 @@
         </w:tc>
         <w:tc>
           <w:tcPr>
-            <w:tcW w:type="dxa" w:w="2150"/>
+            <w:tcW w:type="dxa" w:w="1650"/>
             <w:tcBorders>
               <w:top w:val="single" w:color="CBD5E1" w:sz="4"/>
               <w:left w:val="single" w:color="CBD5E1" w:sz="4"/>
@@ -5229,7 +5229,7 @@
         </w:tc>
         <w:tc>
           <w:tcPr>
-            <w:tcW w:type="dxa" w:w="1900"/>
+            <w:tcW w:type="dxa" w:w="2900"/>
             <w:tcBorders>
               <w:top w:val="single" w:color="CBD5E1" w:sz="4"/>
               <w:left w:val="single" w:color="CBD5E1" w:sz="4"/>
@@ -5254,13 +5254,13 @@
                 <w:sz w:val="18"/>
                 <w:szCs w:val="18"/>
               </w:rPr>
-              <w:t xml:space="preserve">None (no Management)</w:t>
-            </w:r>
-          </w:p>
-        </w:tc>
-        <w:tc>
-          <w:tcPr>
-            <w:tcW w:type="dxa" w:w="1288"/>
+              <w:t xml:space="preserve">The 3 common mailboxes + department Manager and HOD. No Management</w:t>
+            </w:r>
+          </w:p>
+        </w:tc>
+        <w:tc>
+          <w:tcPr>
+            <w:tcW w:type="dxa" w:w="1188"/>
             <w:tcBorders>
               <w:top w:val="single" w:color="CBD5E1" w:sz="4"/>
               <w:left w:val="single" w:color="CBD5E1" w:sz="4"/>
@@ -5296,7 +5296,7 @@
         </w:trPr>
         <w:tc>
           <w:tcPr>
-            <w:tcW w:type="dxa" w:w="1700"/>
+            <w:tcW w:type="dxa" w:w="1500"/>
             <w:tcBorders>
               <w:top w:val="single" w:color="CBD5E1" w:sz="4"/>
               <w:left w:val="single" w:color="CBD5E1" w:sz="4"/>
@@ -5344,7 +5344,7 @@
         </w:tc>
         <w:tc>
           <w:tcPr>
-            <w:tcW w:type="dxa" w:w="2600"/>
+            <w:tcW w:type="dxa" w:w="2400"/>
             <w:tcBorders>
               <w:top w:val="single" w:color="CBD5E1" w:sz="4"/>
               <w:left w:val="single" w:color="CBD5E1" w:sz="4"/>
@@ -5374,7 +5374,7 @@
         </w:tc>
         <w:tc>
           <w:tcPr>
-            <w:tcW w:type="dxa" w:w="2150"/>
+            <w:tcW w:type="dxa" w:w="1650"/>
             <w:tcBorders>
               <w:top w:val="single" w:color="CBD5E1" w:sz="4"/>
               <w:left w:val="single" w:color="CBD5E1" w:sz="4"/>
@@ -5404,37 +5404,37 @@
         </w:tc>
         <w:tc>
           <w:tcPr>
-            <w:tcW w:type="dxa" w:w="1900"/>
-            <w:tcBorders>
-              <w:top w:val="single" w:color="CBD5E1" w:sz="4"/>
-              <w:left w:val="single" w:color="CBD5E1" w:sz="4"/>
-              <w:bottom w:val="single" w:color="CBD5E1" w:sz="4"/>
-              <w:right w:val="single" w:color="CBD5E1" w:sz="4"/>
-            </w:tcBorders>
-            <w:tcMar>
-              <w:top w:type="dxa" w:w="70"/>
-              <w:left w:type="dxa" w:w="100"/>
-              <w:bottom w:type="dxa" w:w="70"/>
-              <w:right w:type="dxa" w:w="100"/>
-            </w:tcMar>
-          </w:tcPr>
-          <w:p>
-            <w:pPr>
-              <w:spacing w:after="30" w:line="250"/>
-            </w:pPr>
-            <w:r>
-              <w:rPr>
-                <w:rFonts w:ascii="Calibri" w:cs="Calibri" w:eastAsia="Calibri" w:hAnsi="Calibri"/>
-                <w:sz w:val="18"/>
-                <w:szCs w:val="18"/>
-              </w:rPr>
-              <w:t xml:space="preserve">Management, but only when more than 10 days late</w:t>
-            </w:r>
-          </w:p>
-        </w:tc>
-        <w:tc>
-          <w:tcPr>
-            <w:tcW w:type="dxa" w:w="1288"/>
+            <w:tcW w:type="dxa" w:w="2900"/>
+            <w:tcBorders>
+              <w:top w:val="single" w:color="CBD5E1" w:sz="4"/>
+              <w:left w:val="single" w:color="CBD5E1" w:sz="4"/>
+              <w:bottom w:val="single" w:color="CBD5E1" w:sz="4"/>
+              <w:right w:val="single" w:color="CBD5E1" w:sz="4"/>
+            </w:tcBorders>
+            <w:tcMar>
+              <w:top w:type="dxa" w:w="70"/>
+              <w:left w:type="dxa" w:w="100"/>
+              <w:bottom w:type="dxa" w:w="70"/>
+              <w:right w:type="dxa" w:w="100"/>
+            </w:tcMar>
+          </w:tcPr>
+          <w:p>
+            <w:pPr>
+              <w:spacing w:after="30" w:line="250"/>
+            </w:pPr>
+            <w:r>
+              <w:rPr>
+                <w:rFonts w:ascii="Calibri" w:cs="Calibri" w:eastAsia="Calibri" w:hAnsi="Calibri"/>
+                <w:sz w:val="18"/>
+                <w:szCs w:val="18"/>
+              </w:rPr>
+              <w:t xml:space="preserve">The 3 common mailboxes + department Manager and HOD. Management is added only when more than 10 days late</w:t>
+            </w:r>
+          </w:p>
+        </w:tc>
+        <w:tc>
+          <w:tcPr>
+            <w:tcW w:type="dxa" w:w="1188"/>
             <w:tcBorders>
               <w:top w:val="single" w:color="CBD5E1" w:sz="4"/>
               <w:left w:val="single" w:color="CBD5E1" w:sz="4"/>
@@ -7240,7 +7240,7 @@
                 <w:sz w:val="18"/>
                 <w:szCs w:val="18"/>
               </w:rPr>
-              <w:t xml:space="preserve">Daily quality digest</w:t>
+              <w:t xml:space="preserve">Monthly quality digest</w:t>
             </w:r>
             <w:r>
               <w:rPr>
@@ -7278,7 +7278,7 @@
                 <w:sz w:val="18"/>
                 <w:szCs w:val="18"/>
               </w:rPr>
-              <w:t xml:space="preserve">Open complaints, due soon, overdue and CAPA numbers, one per company</w:t>
+              <w:t xml:space="preserve">Open complaints, SLA breaches, repeat complaints and open CAPA numbers for the month, one per company</w:t>
             </w:r>
           </w:p>
         </w:tc>
@@ -7351,42 +7351,6 @@
               <w:bottom w:val="single" w:color="CBD5E1" w:sz="4"/>
               <w:right w:val="single" w:color="CBD5E1" w:sz="4"/>
             </w:tcBorders>
-            <w:tcMar>
-              <w:top w:type="dxa" w:w="70"/>
-              <w:left w:type="dxa" w:w="100"/>
-              <w:bottom w:type="dxa" w:w="70"/>
-              <w:right w:type="dxa" w:w="100"/>
-            </w:tcMar>
-          </w:tcPr>
-          <w:p>
-            <w:pPr>
-              <w:spacing w:after="30" w:line="250"/>
-            </w:pPr>
-            <w:r>
-              <w:rPr>
-                <w:rFonts w:ascii="Calibri" w:cs="Calibri" w:eastAsia="Calibri" w:hAnsi="Calibri"/>
-                <w:sz w:val="18"/>
-                <w:szCs w:val="18"/>
-              </w:rPr>
-              <w:t xml:space="preserve">Once a day, Monday to Friday</w:t>
-            </w:r>
-          </w:p>
-        </w:tc>
-      </w:tr>
-      <w:tr>
-        <w:trPr>
-          <w:cantSplit/>
-        </w:trPr>
-        <w:tc>
-          <w:tcPr>
-            <w:tcW w:type="dxa" w:w="1700"/>
-            <w:tcBorders>
-              <w:top w:val="single" w:color="CBD5E1" w:sz="4"/>
-              <w:left w:val="single" w:color="CBD5E1" w:sz="4"/>
-              <w:bottom w:val="single" w:color="CBD5E1" w:sz="4"/>
-              <w:right w:val="single" w:color="CBD5E1" w:sz="4"/>
-            </w:tcBorders>
-            <w:shd w:fill="F8FAFC" w:color="auto" w:val="clear"/>
             <w:tcMar>
               <w:top w:type="dxa" w:w="70"/>
               <w:left w:type="dxa" w:w="100"/>
@@ -7414,139 +7378,15 @@
                 <w:sz w:val="18"/>
                 <w:szCs w:val="18"/>
               </w:rPr>
-              <w:t xml:space="preserve">Weekly quality report</w:t>
-            </w:r>
-            <w:r>
-              <w:rPr>
-                <w:rFonts w:ascii="Calibri" w:cs="Calibri" w:eastAsia="Calibri" w:hAnsi="Calibri"/>
-                <w:sz w:val="18"/>
-                <w:szCs w:val="18"/>
-              </w:rPr>
-              <w:t xml:space="preserve"/>
-            </w:r>
-          </w:p>
-        </w:tc>
-        <w:tc>
-          <w:tcPr>
-            <w:tcW w:type="dxa" w:w="2600"/>
-            <w:tcBorders>
-              <w:top w:val="single" w:color="CBD5E1" w:sz="4"/>
-              <w:left w:val="single" w:color="CBD5E1" w:sz="4"/>
-              <w:bottom w:val="single" w:color="CBD5E1" w:sz="4"/>
-              <w:right w:val="single" w:color="CBD5E1" w:sz="4"/>
-            </w:tcBorders>
-            <w:shd w:fill="F8FAFC" w:color="auto" w:val="clear"/>
-            <w:tcMar>
-              <w:top w:type="dxa" w:w="70"/>
-              <w:left w:type="dxa" w:w="100"/>
-              <w:bottom w:type="dxa" w:w="70"/>
-              <w:right w:type="dxa" w:w="100"/>
-            </w:tcMar>
-          </w:tcPr>
-          <w:p>
-            <w:pPr>
-              <w:spacing w:after="30" w:line="250"/>
-            </w:pPr>
-            <w:r>
-              <w:rPr>
-                <w:rFonts w:ascii="Calibri" w:cs="Calibri" w:eastAsia="Calibri" w:hAnsi="Calibri"/>
-                <w:sz w:val="18"/>
-                <w:szCs w:val="18"/>
-              </w:rPr>
-              <w:t xml:space="preserve">Weekly summary, on Mondays</w:t>
-            </w:r>
-          </w:p>
-        </w:tc>
-        <w:tc>
-          <w:tcPr>
-            <w:tcW w:type="dxa" w:w="2150"/>
-            <w:tcBorders>
-              <w:top w:val="single" w:color="CBD5E1" w:sz="4"/>
-              <w:left w:val="single" w:color="CBD5E1" w:sz="4"/>
-              <w:bottom w:val="single" w:color="CBD5E1" w:sz="4"/>
-              <w:right w:val="single" w:color="CBD5E1" w:sz="4"/>
-            </w:tcBorders>
-            <w:shd w:fill="F8FAFC" w:color="auto" w:val="clear"/>
-            <w:tcMar>
-              <w:top w:type="dxa" w:w="70"/>
-              <w:left w:type="dxa" w:w="100"/>
-              <w:bottom w:type="dxa" w:w="70"/>
-              <w:right w:type="dxa" w:w="100"/>
-            </w:tcMar>
-          </w:tcPr>
-          <w:p>
-            <w:pPr>
-              <w:spacing w:after="30" w:line="250"/>
-            </w:pPr>
-            <w:r>
-              <w:rPr>
-                <w:rFonts w:ascii="Calibri" w:cs="Calibri" w:eastAsia="Calibri" w:hAnsi="Calibri"/>
-                <w:sz w:val="18"/>
-                <w:szCs w:val="18"/>
-              </w:rPr>
-              <w:t xml:space="preserve">Quality Head, Management, Master Admin</w:t>
-            </w:r>
-          </w:p>
-        </w:tc>
-        <w:tc>
-          <w:tcPr>
-            <w:tcW w:type="dxa" w:w="1900"/>
-            <w:tcBorders>
-              <w:top w:val="single" w:color="CBD5E1" w:sz="4"/>
-              <w:left w:val="single" w:color="CBD5E1" w:sz="4"/>
-              <w:bottom w:val="single" w:color="CBD5E1" w:sz="4"/>
-              <w:right w:val="single" w:color="CBD5E1" w:sz="4"/>
-            </w:tcBorders>
-            <w:shd w:fill="F8FAFC" w:color="auto" w:val="clear"/>
-            <w:tcMar>
-              <w:top w:type="dxa" w:w="70"/>
-              <w:left w:type="dxa" w:w="100"/>
-              <w:bottom w:type="dxa" w:w="70"/>
-              <w:right w:type="dxa" w:w="100"/>
-            </w:tcMar>
-          </w:tcPr>
-          <w:p>
-            <w:pPr>
-              <w:spacing w:after="30" w:line="250"/>
-            </w:pPr>
-            <w:r>
-              <w:rPr>
-                <w:rFonts w:ascii="Calibri" w:cs="Calibri" w:eastAsia="Calibri" w:hAnsi="Calibri"/>
-                <w:sz w:val="18"/>
-                <w:szCs w:val="18"/>
-              </w:rPr>
-              <w:t xml:space="preserve">None</w:t>
-            </w:r>
-          </w:p>
-        </w:tc>
-        <w:tc>
-          <w:tcPr>
-            <w:tcW w:type="dxa" w:w="1288"/>
-            <w:tcBorders>
-              <w:top w:val="single" w:color="CBD5E1" w:sz="4"/>
-              <w:left w:val="single" w:color="CBD5E1" w:sz="4"/>
-              <w:bottom w:val="single" w:color="CBD5E1" w:sz="4"/>
-              <w:right w:val="single" w:color="CBD5E1" w:sz="4"/>
-            </w:tcBorders>
-            <w:shd w:fill="F8FAFC" w:color="auto" w:val="clear"/>
-            <w:tcMar>
-              <w:top w:type="dxa" w:w="70"/>
-              <w:left w:type="dxa" w:w="100"/>
-              <w:bottom w:type="dxa" w:w="70"/>
-              <w:right w:type="dxa" w:w="100"/>
-            </w:tcMar>
-          </w:tcPr>
-          <w:p>
-            <w:pPr>
-              <w:spacing w:after="30" w:line="250"/>
-            </w:pPr>
-            <w:r>
-              <w:rPr>
-                <w:rFonts w:ascii="Calibri" w:cs="Calibri" w:eastAsia="Calibri" w:hAnsi="Calibri"/>
-                <w:sz w:val="18"/>
-                <w:szCs w:val="18"/>
-              </w:rPr>
-              <w:t xml:space="preserve">Once a week</w:t>
+              <w:t xml:space="preserve">Once a month</w:t>
+            </w:r>
+            <w:r>
+              <w:rPr>
+                <w:rFonts w:ascii="Calibri" w:cs="Calibri" w:eastAsia="Calibri" w:hAnsi="Calibri"/>
+                <w:sz w:val="18"/>
+                <w:szCs w:val="18"/>
+              </w:rPr>
+              <w:t xml:space="preserve">, on the 1st</w:t>
             </w:r>
           </w:p>
         </w:tc>
@@ -9801,7 +9641,7 @@
                 <w:sz w:val="18"/>
                 <w:szCs w:val="18"/>
               </w:rPr>
-              <w:t xml:space="preserve">Add the domain to the EMAIL_ALLOWED_DOMAINS setting in Vercel. The default is onepws.com only.</w:t>
+              <w:t xml:space="preserve">Add the domain to the EMAIL_ALLOWED_DOMAINS setting in Vercel (comma-separated). The default is onepws.com, wmspl.co.in and pwsfloor.com.</w:t>
             </w:r>
           </w:p>
         </w:tc>
@@ -10182,7 +10022,7 @@
                 <w:sz w:val="18"/>
                 <w:szCs w:val="18"/>
               </w:rPr>
-              <w:t xml:space="preserve">An address outside @onepws.com was removed. Check the Employee Directory for a wrongly typed address.</w:t>
+              <w:t xml:space="preserve">An address outside the allowed company domains was removed. Check the Employee Directory for a wrongly typed address.</w:t>
             </w:r>
           </w:p>
         </w:tc>

</xml_diff>